<commit_message>
Move complete analysis into handbook-ordered notebook
Place data retrieval, assembly and read screening, BLAST, review summaries,
and curator findings directly in the eight notebook tasks. Execute the same
notebook through Snakemake and remove the duplicate analysis scripts.
Update dependencies, run instructions, report, and executed outputs.

Validation: full analysis reproduced 246 flags from 3,006 assemblies and
matched prior scientific results. A clean offline notebook workflow passed
with 5 flags from 13 assemblies; all 25 code cells executed successfully.

Co-authored-by: Kuanysh Bakizhan <258616596+karp3n3@users.noreply.github.com>
</commit_message>
<xml_diff>
--- a/report/CSI_Genome_Report.docx
+++ b/report/CSI_Genome_Report.docx
@@ -414,20 +414,7 @@
         <w:rPr>
           <w:color w:val="000000"/>
         </w:rPr>
-        <w:t xml:space="preserve">The dataset contains </w:t>
-      </w:r>
-      <w:r>
-        <w:rPr>
-          <w:b/>
-          <w:color w:val="000000"/>
-        </w:rPr>
-        <w:t>3,006 assemblies, 317,568 contigs and 3,674,465,179 bases</w:t>
-      </w:r>
-      <w:r>
-        <w:rPr>
-          <w:color w:val="000000"/>
-        </w:rPr>
-        <w:t>. Archive files were downloaded on 29 September; this analysis and the BLAST checks were run on 30 September 2026.</w:t>
+        <w:t>The dataset contains 3,006 assemblies, 317,568 contigs and 3,674,465,179 bases. The study snapshot was retrieved on 29 September 2026 and the original BLAST checks were run on 30 September. The complete notebook analysis was rerun on 1 October using the same versioned records and cached BLAST responses.</w:t>
       </w:r>
     </w:p>
     <w:tbl>
@@ -5099,7 +5086,7 @@
         <w:rPr>
           <w:color w:val="000000"/>
         </w:rPr>
-        <w:t>The repository contains the Python scripts, an executed notebook, a Snakemake workflow, pinned dependencies and a small real test dataset. The notebook explains the saved outputs; Snakemake runs the analysis steps. All assembly and read accessions are saved in the config files.</w:t>
+        <w:t>The repository contains one executable Jupyter notebook with all analysis code, a Snakemake workflow that runs the same notebook, pinned dependencies and a small real test dataset. Its eight tasks follow the handbook in order. All assembly and read accessions are saved in the config files.</w:t>
       </w:r>
     </w:p>
     <w:p>
@@ -5176,59 +5163,7 @@
         <w:rPr>
           <w:color w:val="000000"/>
         </w:rPr>
-        <w:t xml:space="preserve">On the macOS machine used for this run, adapter scanning took </w:t>
-      </w:r>
-      <w:r>
-        <w:rPr>
-          <w:b/>
-          <w:color w:val="000000"/>
-        </w:rPr>
-        <w:t>120.0 s</w:t>
-      </w:r>
-      <w:r>
-        <w:rPr>
-          <w:color w:val="000000"/>
-        </w:rPr>
-        <w:t xml:space="preserve">, panel and vector alignment </w:t>
-      </w:r>
-      <w:r>
-        <w:rPr>
-          <w:b/>
-          <w:color w:val="000000"/>
-        </w:rPr>
-        <w:t>80.1 s</w:t>
-      </w:r>
-      <w:r>
-        <w:rPr>
-          <w:color w:val="000000"/>
-        </w:rPr>
-        <w:t xml:space="preserve">, and read checks </w:t>
-      </w:r>
-      <w:r>
-        <w:rPr>
-          <w:b/>
-          <w:color w:val="000000"/>
-        </w:rPr>
-        <w:t>27.1 s</w:t>
-      </w:r>
-      <w:r>
-        <w:rPr>
-          <w:color w:val="000000"/>
-        </w:rPr>
-        <w:t xml:space="preserve">. Alignment peak memory was </w:t>
-      </w:r>
-      <w:r>
-        <w:rPr>
-          <w:b/>
-          <w:color w:val="000000"/>
-        </w:rPr>
-        <w:t>355 MiB</w:t>
-      </w:r>
-      <w:r>
-        <w:rPr>
-          <w:color w:val="000000"/>
-        </w:rPr>
-        <w:t>. These component times exclude downloads, environment setup and NCBI waiting time. Input sequences total 3.67 billion bases; the intermediate query FASTA is about 3.4 GiB.</w:t>
+        <w:t>On the macOS notebook rerun, adapter scanning took 117.9 s, panel and vector alignment 80.2 s, and read checks 34.4 s. The notebook process peak memory recorded after alignment was 1188 MiB, including earlier stages. These component times exclude downloads, environment setup and NCBI waiting time. Input sequences total 3.67 billion bases; the intermediate query FASTA is about 3.4 GiB.</w:t>
       </w:r>
     </w:p>
     <w:p>

</xml_diff>

<commit_message>
Extend chimera screening and BLAST review in notebook
Add native/native split candidates with circular join distances and per-run
percentages. Expand BLAST to 1 kb windows from 40 panel/GC-selected contigs,
keeping the contamination score unchanged and showing provisional verdicts.
Fix the pandas concatenation warning and record the task leads consistently.
Regenerate executed notebook, HTML, report, and result tables.

Validation: full 3,006-assembly rerun and clean 13-assembly offline workflow;
32 native/native candidates across 6,000 long reads; all 40 BLAST responses
saved. Circular-origin and split-alignment checks pass. Main flags remain
246/3,006 and report numbers agree with results.

Co-authored-by: Kuanysh Bakizhan <258616596+karp3n3@users.noreply.github.com>
</commit_message>
<xml_diff>
--- a/report/CSI_Genome_Report.docx
+++ b/report/CSI_Genome_Report.docx
@@ -414,7 +414,7 @@
         <w:rPr>
           <w:color w:val="000000"/>
         </w:rPr>
-        <w:t>The dataset contains 3,006 assemblies, 317,568 contigs and 3,674,465,179 bases. The study snapshot was retrieved on 29 September 2026 and the original BLAST checks were run on 30 September. The complete notebook analysis was rerun on 1 October using the same versioned records and cached BLAST responses.</w:t>
+        <w:t>The dataset contains 3,006 assemblies, 317,568 contigs and 3,674,465,179 bases. The study snapshot was retrieved on 29 September 2026. The revised notebook was rerun on 1 October, including an expanded BLAST batch of 40 contigs. Exact queries, server responses and submission times are saved in data/blast_cache/.</w:t>
       </w:r>
     </w:p>
     <w:tbl>
@@ -724,10 +724,10 @@
             <w:r>
               <w:rPr>
                 <w:b w:val="0"/>
+                <w:color w:val="000000"/>
                 <w:sz w:val="20"/>
-                <w:color w:val="000000"/>
               </w:rPr>
-              <w:t>Identification of three suspicious 1 kb sequences. The request used nt; the server returned core_nt.</w:t>
+              <w:t>BLAST windows from 40 suspicious contigs. The request used nt; the server returned core_nt.</w:t>
             </w:r>
           </w:p>
         </w:tc>
@@ -1775,7 +1775,7 @@
         <w:rPr>
           <w:color w:val="000000"/>
         </w:rPr>
-        <w:t>We submitted one 1 kb window from each of the three strongest foreign candidates to NCBI BLAST. We used megablast, an expectation threshold of 1e-10 and up to 20 hits, excluding hits to the query record itself. A BLAST window checks the identity of that piece; the panel alignment provides support across the contig. Exact queries and raw responses are saved.</w:t>
+        <w:t>We selected 40 contigs: 28 with foreign-panel matches and 12 additional contigs of at least 1 kb whose GC differed from the assembly by more than 12 percentage points. We retained the quick 1 kb window search, centred on the panel match or contig centre. Megablast used an expectation threshold of 1e-10 and up to 20 hits, excluding self hits. The unchanged score gives 3 contamination candidates and 23 HGT/construct candidates; 14 remain unclear. Best hits, identity and provisional verdicts are in results/blast_summary.csv and Task 6. A window hit does not prove whole-contig origin or natural HGT.</w:t>
       </w:r>
     </w:p>
     <w:p>
@@ -3126,20 +3126,7 @@
         <w:rPr>
           <w:color w:val="000000"/>
         </w:rPr>
-        <w:t xml:space="preserve">We checked the first </w:t>
-      </w:r>
-      <w:r>
-        <w:rPr>
-          <w:b/>
-          <w:color w:val="000000"/>
-        </w:rPr>
-        <w:t>2,000 reads from each of two Oxford Nanopore runs and one PacBio run</w:t>
-      </w:r>
-      <w:r>
-        <w:rPr>
-          <w:color w:val="000000"/>
-        </w:rPr>
-        <w:t>. A chimera is a read that joins pieces which should not belong together. The search looks for a read with one alignment to its native assembly and another to the foreign panel.</w:t>
+        <w:t>We checked the first 2,000 reads from each of two Oxford Nanopore runs and one PacBio run. The screen now covers both native-plus-foreign joins and split alignments within the native assembly. The table reports unique candidate reads and their percentage among all reads examined in each run.</w:t>
       </w:r>
     </w:p>
     <w:p>
@@ -3306,10 +3293,10 @@
             <w:r>
               <w:rPr>
                 <w:b/>
+                <w:color w:val="000000"/>
                 <w:sz w:val="20"/>
-                <w:color w:val="000000"/>
               </w:rPr>
-              <w:t>Split reads</w:t>
+              <w:t>Chimera candidates</w:t>
             </w:r>
           </w:p>
         </w:tc>
@@ -3355,8 +3342,8 @@
             <w:r>
               <w:rPr>
                 <w:b w:val="0"/>
+                <w:color w:val="000000"/>
                 <w:sz w:val="20"/>
-                <w:color w:val="000000"/>
               </w:rPr>
               <w:t>2,662 bp</w:t>
             </w:r>
@@ -3377,8 +3364,8 @@
             <w:r>
               <w:rPr>
                 <w:b w:val="0"/>
+                <w:color w:val="000000"/>
                 <w:sz w:val="20"/>
-                <w:color w:val="000000"/>
               </w:rPr>
               <w:t>93.97%</w:t>
             </w:r>
@@ -3399,10 +3386,10 @@
             <w:r>
               <w:rPr>
                 <w:b w:val="0"/>
+                <w:color w:val="000000"/>
                 <w:sz w:val="20"/>
-                <w:color w:val="000000"/>
               </w:rPr>
-              <w:t>0/2000</w:t>
+              <w:t>4/2000 (0.20%)</w:t>
             </w:r>
           </w:p>
         </w:tc>
@@ -3448,8 +3435,8 @@
             <w:r>
               <w:rPr>
                 <w:b w:val="0"/>
+                <w:color w:val="000000"/>
                 <w:sz w:val="20"/>
-                <w:color w:val="000000"/>
               </w:rPr>
               <w:t>8,370 bp</w:t>
             </w:r>
@@ -3470,8 +3457,8 @@
             <w:r>
               <w:rPr>
                 <w:b w:val="0"/>
+                <w:color w:val="000000"/>
                 <w:sz w:val="20"/>
-                <w:color w:val="000000"/>
               </w:rPr>
               <w:t>84.56%</w:t>
             </w:r>
@@ -3492,10 +3479,10 @@
             <w:r>
               <w:rPr>
                 <w:b w:val="0"/>
+                <w:color w:val="000000"/>
                 <w:sz w:val="20"/>
-                <w:color w:val="000000"/>
               </w:rPr>
-              <w:t>0/2000</w:t>
+              <w:t>28/2000 (1.40%)</w:t>
             </w:r>
           </w:p>
         </w:tc>
@@ -3541,8 +3528,8 @@
             <w:r>
               <w:rPr>
                 <w:b w:val="0"/>
+                <w:color w:val="000000"/>
                 <w:sz w:val="20"/>
-                <w:color w:val="000000"/>
               </w:rPr>
               <w:t>3,419 bp</w:t>
             </w:r>
@@ -3563,8 +3550,8 @@
             <w:r>
               <w:rPr>
                 <w:b w:val="0"/>
+                <w:color w:val="000000"/>
                 <w:sz w:val="20"/>
-                <w:color w:val="000000"/>
               </w:rPr>
               <w:t>99.95%</w:t>
             </w:r>
@@ -3585,10 +3572,10 @@
             <w:r>
               <w:rPr>
                 <w:b w:val="0"/>
+                <w:color w:val="000000"/>
                 <w:sz w:val="20"/>
-                <w:color w:val="000000"/>
               </w:rPr>
-              <w:t>0/2000</w:t>
+              <w:t>0/2000 (0.00%)</w:t>
             </w:r>
           </w:p>
         </w:tc>
@@ -3612,20 +3599,7 @@
         <w:rPr>
           <w:color w:val="000000"/>
         </w:rPr>
-        <w:t xml:space="preserve">ONT uses map-ont; the PacBio Sequel IIe run uses map-hifi. A chimera candidate needs two alignments with MAPQ at least 20, at least 300 query bases each and no more than 50 bases of overlap. We found </w:t>
-      </w:r>
-      <w:r>
-        <w:rPr>
-          <w:b/>
-          <w:color w:val="000000"/>
-        </w:rPr>
-        <w:t>zero native-plus-foreign splits</w:t>
-      </w:r>
-      <w:r>
-        <w:rPr>
-          <w:color w:val="000000"/>
-        </w:rPr>
-        <w:t>. The upper 95% Wilson bound is about 0.19% per run, conditional on this screen and sampling scheme.</w:t>
+        <w:t>Minimap2 uses map-ont for ONT and map-hifi for PacBio, with secondary alignments excluded. Both pieces need MAPQ &gt;=20 and at most 50 bp overlap. Native-plus-foreign pieces need &gt;=300 bp each (0 found). Native-plus-native pieces need &gt;=500 bp each and different contigs, opposite strands or a gap &gt;10 kb (32 found). For the same circular chromosome, distance = min(d, genome_length - d), using the reference ends at the query join.</w:t>
       </w:r>
     </w:p>
     <w:p>
@@ -3633,7 +3607,7 @@
         <w:rPr>
           <w:color w:val="000000"/>
         </w:rPr>
-        <w:t>Alignment differences include real strain differences as well as sequencing errors. Rearrangements within the same organism and contaminants absent from the panel are not tested by this chimera rule.</w:t>
+        <w:t>Such reads are dangerous because they can look like genome rearrangements. These are candidate chimeras: real structural or strain differences can also produce split alignments. Contaminants absent from the panel can still be missed.</w:t>
       </w:r>
     </w:p>
     <w:p>
@@ -5025,20 +4999,7 @@
         <w:rPr>
           <w:color w:val="000000"/>
         </w:rPr>
-        <w:t xml:space="preserve">Our screen found </w:t>
-      </w:r>
-      <w:r>
-        <w:rPr>
-          <w:b/>
-          <w:color w:val="000000"/>
-        </w:rPr>
-        <w:t>246 flagged assemblies out of 3,006 (8.18%)</w:t>
-      </w:r>
-      <w:r>
-        <w:rPr>
-          <w:color w:val="000000"/>
-        </w:rPr>
-        <w:t>. Most flags were adapter motifs. The strongest foreign cases matched E. coli DNA and mouse mitochondrial DNA. The seven raw-read examples also showed clear adapter read-through in one MiSeq run, while the tested long-read and pooled-run checks found no positive candidates.</w:t>
+        <w:t>Our screen found 246 flagged assemblies out of 3,006 (8.18%), mostly adapter motifs. The strongest foreign cases matched E. coli and mouse mitochondrial DNA. The seven read examples showed adapter read-through in one MiSeq run, 32 native-plus-native split candidates and 0 native-plus-foreign splits. Neither pooled-run check found cross-assigned pairs.</w:t>
       </w:r>
     </w:p>
     <w:p>
@@ -5163,7 +5124,7 @@
         <w:rPr>
           <w:color w:val="000000"/>
         </w:rPr>
-        <w:t>On the macOS notebook rerun, adapter scanning took 117.9 s, panel and vector alignment 80.2 s, and read checks 34.4 s. The notebook process peak memory recorded after alignment was 1188 MiB, including earlier stages. These component times exclude downloads, environment setup and NCBI waiting time. Input sequences total 3.67 billion bases; the intermediate query FASTA is about 3.4 GiB.</w:t>
+        <w:t>On the macOS notebook rerun, adapter scanning took 118.4 s, panel and vector alignment 80.2 s, and read checks 33.5 s. The notebook process peak memory recorded after alignment was 1350 MiB, including earlier stages. These times exclude downloads, setup and NCBI waiting time. Inputs total 3.67 billion bases; the intermediate FASTA is about 3.4 GiB.</w:t>
       </w:r>
     </w:p>
     <w:p>
@@ -5190,7 +5151,7 @@
         <w:rPr>
           <w:color w:val="000000"/>
         </w:rPr>
-        <w:t>Abylaikhan Torekhan and Kuanysh Bakizhan both worked on the code and checked the results. The work was shared rather than divided into separate coding and checking roles. Both partners are responsible for the final report and for explaining the full analysis at the defence.</w:t>
+        <w:t>Abylaikhan Torekhan led Tasks 1–3 and 6: data retrieval, metadata, adapter and foreign-DNA screening, and BLAST. Kuanysh Bakizhan led Tasks 4–5 and 7–8: short and long reads, error checking, and curator findings. Both authors wrote the report.</w:t>
       </w:r>
     </w:p>
     <w:p>

</xml_diff>